<commit_message>
Upload the power bi after Deployment , Manage the folders
</commit_message>
<xml_diff>
--- a/SnowFlake/Document/databricks_snowflake_connection_guide.docx
+++ b/SnowFlake/Document/databricks_snowflake_connection_guide.docx
@@ -92,7 +92,7 @@
           <w:sz w:val="22"/>
           <w:szCs w:val="22"/>
         </w:rPr>
-        <w:t xml:space="preserve">Account: YTRRMJE-ZZ81345  |  User: DATADOSE01  |  Cloud: Azure</w:t>
+        <w:t xml:space="preserve">Account: TLFCMYB-UJ75221  |  User: DataDose  |  Cloud: Azure</w:t>
       </w:r>
     </w:p>
     <w:p>
@@ -153,7 +153,7 @@
           <w:sz w:val="22"/>
           <w:szCs w:val="22"/>
         </w:rPr>
-        <w:t xml:space="preserve">This guide covers every step required to connect Azure Databricks (PySpark) to your Snowflake account YTRRMJE-ZZ81345. Follow the 7 steps in order — each step depends on the previous one being complete.</w:t>
+        <w:t xml:space="preserve">This guide covers every step required to connect Azure Databricks (PySpark) to your Snowflake account TLFCMYB-UJ75221. Follow the 7 steps in order — each step depends on the previous one being complete.</w:t>
       </w:r>
     </w:p>
     <w:p>
@@ -1366,7 +1366,7 @@
                 <w:sz w:val="18"/>
                 <w:szCs w:val="18"/>
               </w:rPr>
-              <w:t xml:space="preserve">  PASSWORD             = 'PharmaAzure2024!'</w:t>
+              <w:t xml:space="preserve">  PASSWORD             = 'DataDoseAzure2025!'</w:t>
             </w:r>
           </w:p>
           <w:p>
@@ -1464,21 +1464,21 @@
                 <w:sz w:val="18"/>
                 <w:szCs w:val="18"/>
               </w:rPr>
-              <w:t xml:space="preserve">-- Grant role to admin user so DATADOSE01 can USE ROLE PYSPARK_ROLE</w:t>
-            </w:r>
-          </w:p>
-          <w:p>
-            <w:pPr>
-              <w:spacing w:before="20" w:after="20"/>
-            </w:pPr>
-            <w:r>
-              <w:rPr>
-                <w:rFonts w:ascii="Courier New" w:cs="Courier New" w:eastAsia="Courier New" w:hAnsi="Courier New"/>
-                <w:color w:val="1A1A2E"/>
-                <w:sz w:val="18"/>
-                <w:szCs w:val="18"/>
-              </w:rPr>
-              <w:t xml:space="preserve">GRANT ROLE PYSPARK_ROLE TO USER DATADOSE01;</w:t>
+              <w:t xml:space="preserve">-- Grant role to admin user so DataDose can USE ROLE PYSPARK_ROLE</w:t>
+            </w:r>
+          </w:p>
+          <w:p>
+            <w:pPr>
+              <w:spacing w:before="20" w:after="20"/>
+            </w:pPr>
+            <w:r>
+              <w:rPr>
+                <w:rFonts w:ascii="Courier New" w:cs="Courier New" w:eastAsia="Courier New" w:hAnsi="Courier New"/>
+                <w:color w:val="1A1A2E"/>
+                <w:sz w:val="18"/>
+                <w:szCs w:val="18"/>
+              </w:rPr>
+              <w:t xml:space="preserve">GRANT ROLE PYSPARK_ROLE TO USER DataDose;</w:t>
             </w:r>
           </w:p>
           <w:p>
@@ -1534,7 +1534,7 @@
                 <w:sz w:val="18"/>
                 <w:szCs w:val="18"/>
               </w:rPr>
-              <w:t xml:space="preserve">SHOW GRANTS TO USER DATADOSE01;</w:t>
+              <w:t xml:space="preserve">SHOW GRANTS TO USER DataDose;</w:t>
             </w:r>
           </w:p>
         </w:tc>
@@ -1586,7 +1586,7 @@
                 <w:sz w:val="20"/>
                 <w:szCs w:val="20"/>
               </w:rPr>
-              <w:t xml:space="preserve">Use a strong password. Replace PharmaAzure2024! with your own secure password before running.</w:t>
+              <w:t xml:space="preserve">Use a strong password. Replace DataDoseAzure2025! with your own secure password before running.</w:t>
             </w:r>
           </w:p>
         </w:tc>
@@ -1850,7 +1850,7 @@
                 <w:sz w:val="18"/>
                 <w:szCs w:val="18"/>
               </w:rPr>
-              <w:t xml:space="preserve">  --value "YTRRMJE-ZZ81345"</w:t>
+              <w:t xml:space="preserve">  --value "TLFCMYB-UJ75221"</w:t>
             </w:r>
           </w:p>
           <w:p>
@@ -1934,7 +1934,7 @@
                 <w:sz w:val="18"/>
                 <w:szCs w:val="18"/>
               </w:rPr>
-              <w:t xml:space="preserve">  --value "PharmaAzure2024!"</w:t>
+              <w:t xml:space="preserve">  --value "DataDoseAzure2025!"</w:t>
             </w:r>
           </w:p>
           <w:p>
@@ -2901,7 +2901,7 @@
                 <w:sz w:val="18"/>
                 <w:szCs w:val="18"/>
               </w:rPr>
-              <w:t xml:space="preserve">    "sfURL"       : "YTRRMJE-ZZ81345.snowflakecomputing.com",</w:t>
+              <w:t xml:space="preserve">    "sfURL"       : "TLFCMYB-UJ75221.snowflakecomputing.com",</w:t>
             </w:r>
           </w:p>
           <w:p>
@@ -4678,7 +4678,7 @@
                 <w:sz w:val="19"/>
                 <w:szCs w:val="19"/>
               </w:rPr>
-              <w:t xml:space="preserve">Must be: YTRRMJE-ZZ81345.snowflakecomputing.com</w:t>
+              <w:t xml:space="preserve">Must be: TLFCMYB-UJ75221.snowflakecomputing.com</w:t>
             </w:r>
           </w:p>
         </w:tc>
@@ -5249,7 +5249,7 @@
                 <w:sz w:val="17"/>
                 <w:szCs w:val="17"/>
               </w:rPr>
-              <w:t xml:space="preserve">YTRRMJE-ZZ81345</w:t>
+              <w:t xml:space="preserve">TLFCMYB-UJ75221</w:t>
             </w:r>
           </w:p>
         </w:tc>
@@ -5313,7 +5313,7 @@
                 <w:sz w:val="17"/>
                 <w:szCs w:val="17"/>
               </w:rPr>
-              <w:t xml:space="preserve">YTRRMJE-ZZ81345.snowflakecomputing.com</w:t>
+              <w:t xml:space="preserve">TLFCMYB-UJ75221.snowflakecomputing.com</w:t>
             </w:r>
           </w:p>
         </w:tc>
@@ -5377,7 +5377,7 @@
                 <w:sz w:val="17"/>
                 <w:szCs w:val="17"/>
               </w:rPr>
-              <w:t xml:space="preserve">DATADOSE01</w:t>
+              <w:t xml:space="preserve">DataDose</w:t>
             </w:r>
           </w:p>
         </w:tc>
@@ -5951,7 +5951,7 @@
         <w:sz w:val="16"/>
         <w:szCs w:val="16"/>
       </w:rPr>
-      <w:t xml:space="preserve">Account: YTRRMJE-ZZ81345  |  Pharma Analytics Platform  |  v1.0</w:t>
+      <w:t xml:space="preserve">Account: TLFCMYB-UJ75221  |  Pharma Analytics Platform  |  v1.0</w:t>
     </w:r>
   </w:p>
 </w:ftr>

</xml_diff>